<commit_message>
docs: update report generators for new folder structure, add style guide
- Fix output paths in all 4 generators to target new topic folders
- Improve metrics explainer: native Word TOC field, better cover page
- Add STYLE_GUIDE.md for consistent report generator development
- Remove duplicate metrics_explainer.docx from generators/
- Add STYLE_GUIDE.md link to CLAUDE.md working docs section
</commit_message>
<xml_diff>
--- a/docs/tuning/metrics-explainer.docx
+++ b/docs/tuning/metrics-explainer.docx
@@ -4,45 +4,43 @@
   <w:body>
     <w:p/>
     <w:p/>
-    <w:p/>
     <w:p>
       <w:pPr>
         <w:jc w:val="center"/>
       </w:pPr>
       <w:r>
-        <w:rPr>
-          <w:rFonts w:ascii="Calibri" w:hAnsi="Calibri"/>
-          <w:b/>
-          <w:color w:val="1A3A5C"/>
-          <w:sz w:val="96"/>
-        </w:rPr>
-        <w:t>ARGOS</w:t>
-      </w:r>
-    </w:p>
-    <w:p>
-      <w:pPr>
-        <w:jc w:val="center"/>
-      </w:pPr>
-      <w:r>
-        <w:rPr>
-          <w:rFonts w:ascii="Calibri" w:hAnsi="Calibri"/>
-          <w:color w:val="2A5A8C"/>
-          <w:sz w:val="44"/>
-        </w:rPr>
-        <w:t>Speech Recognition Metrics Explainer</w:t>
-      </w:r>
-    </w:p>
-    <w:p>
-      <w:pPr>
-        <w:jc w:val="center"/>
-      </w:pPr>
-      <w:r>
-        <w:rPr>
-          <w:rFonts w:ascii="Calibri" w:hAnsi="Calibri"/>
-          <w:color w:val="2A5A8C"/>
-          <w:sz w:val="40"/>
-        </w:rPr>
-        <w:t>The Orchard</w:t>
+        <w:drawing>
+          <wp:inline xmlns:a="http://schemas.openxmlformats.org/drawingml/2006/main" xmlns:pic="http://schemas.openxmlformats.org/drawingml/2006/picture">
+            <wp:extent cx="2286000" cy="2286000"/>
+            <wp:docPr id="1" name="Picture 1"/>
+            <wp:cNvGraphicFramePr>
+              <a:graphicFrameLocks noChangeAspect="1"/>
+            </wp:cNvGraphicFramePr>
+            <a:graphic>
+              <a:graphicData uri="http://schemas.openxmlformats.org/drawingml/2006/picture">
+                <pic:pic>
+                  <pic:nvPicPr>
+                    <pic:cNvPr id="0" name="peacock.png"/>
+                    <pic:cNvPicPr/>
+                  </pic:nvPicPr>
+                  <pic:blipFill>
+                    <a:blip r:embed="rId11"/>
+                    <a:stretch>
+                      <a:fillRect/>
+                    </a:stretch>
+                  </pic:blipFill>
+                  <pic:spPr>
+                    <a:xfrm>
+                      <a:off x="0" y="0"/>
+                      <a:ext cx="2286000" cy="2286000"/>
+                    </a:xfrm>
+                    <a:prstGeom prst="rect"/>
+                  </pic:spPr>
+                </pic:pic>
+              </a:graphicData>
+            </a:graphic>
+          </wp:inline>
+        </w:drawing>
       </w:r>
     </w:p>
     <w:p/>
@@ -54,18 +52,10 @@
         <w:rPr>
           <w:rFonts w:ascii="Calibri" w:hAnsi="Calibri"/>
           <w:b/>
-          <w:color w:val="333333"/>
-          <w:sz w:val="22"/>
-        </w:rPr>
-        <w:t xml:space="preserve">Metrics covered: </w:t>
-      </w:r>
-      <w:r>
-        <w:rPr>
-          <w:rFonts w:ascii="Calibri" w:hAnsi="Calibri"/>
-          <w:color w:val="333333"/>
-          <w:sz w:val="22"/>
-        </w:rPr>
-        <w:t>WER, WWER, NEA (Recall/Precision/F1), Word Alignment</w:t>
+          <w:color w:val="1A3A5C"/>
+          <w:sz w:val="96"/>
+        </w:rPr>
+        <w:t>ARGOS</w:t>
       </w:r>
     </w:p>
     <w:p>
@@ -75,19 +65,10 @@
       <w:r>
         <w:rPr>
           <w:rFonts w:ascii="Calibri" w:hAnsi="Calibri"/>
-          <w:b/>
-          <w:color w:val="333333"/>
-          <w:sz w:val="22"/>
-        </w:rPr>
-        <w:t xml:space="preserve">Data source: </w:t>
-      </w:r>
-      <w:r>
-        <w:rPr>
-          <w:rFonts w:ascii="Calibri" w:hAnsi="Calibri"/>
-          <w:color w:val="333333"/>
-          <w:sz w:val="22"/>
-        </w:rPr>
-        <w:t>1,497 AVSpeech segments, 13 tuning experiments</w:t>
+          <w:color w:val="2A5A8C"/>
+          <w:sz w:val="44"/>
+        </w:rPr>
+        <w:t>Speech Recognition Metrics Explainer</w:t>
       </w:r>
     </w:p>
     <w:p>
@@ -97,11 +78,39 @@
       <w:r>
         <w:rPr>
           <w:rFonts w:ascii="Calibri" w:hAnsi="Calibri"/>
+          <w:color w:val="2A5A8C"/>
+          <w:sz w:val="40"/>
+        </w:rPr>
+        <w:t>The Orchard</w:t>
+      </w:r>
+    </w:p>
+    <w:p/>
+    <w:p>
+      <w:pPr>
+        <w:jc w:val="center"/>
+      </w:pPr>
+      <w:r>
+        <w:rPr>
+          <w:rFonts w:ascii="Calibri" w:hAnsi="Calibri"/>
+          <w:color w:val="333333"/>
+          <w:sz w:val="28"/>
+        </w:rPr>
+        <w:t>Yoad Oxman</w:t>
+      </w:r>
+    </w:p>
+    <w:p/>
+    <w:p>
+      <w:pPr>
+        <w:jc w:val="center"/>
+      </w:pPr>
+      <w:r>
+        <w:rPr>
+          <w:rFonts w:ascii="Calibri" w:hAnsi="Calibri"/>
           <w:b/>
           <w:color w:val="333333"/>
           <w:sz w:val="22"/>
         </w:rPr>
-        <w:t xml:space="preserve">Last updated: </w:t>
+        <w:t xml:space="preserve">Metrics covered: </w:t>
       </w:r>
       <w:r>
         <w:rPr>
@@ -109,13 +118,72 @@
           <w:color w:val="333333"/>
           <w:sz w:val="22"/>
         </w:rPr>
-        <w:t>February 19, 2026</w:t>
+        <w:t>WER, WWER, NEA (Recall/Precision/F1), Word Alignment</w:t>
       </w:r>
     </w:p>
     <w:p>
+      <w:pPr>
+        <w:jc w:val="center"/>
+      </w:pPr>
+      <w:r>
+        <w:rPr>
+          <w:rFonts w:ascii="Calibri" w:hAnsi="Calibri"/>
+          <w:b/>
+          <w:color w:val="333333"/>
+          <w:sz w:val="22"/>
+        </w:rPr>
+        <w:t xml:space="preserve">Data source: </w:t>
+      </w:r>
+      <w:r>
+        <w:rPr>
+          <w:rFonts w:ascii="Calibri" w:hAnsi="Calibri"/>
+          <w:color w:val="333333"/>
+          <w:sz w:val="22"/>
+        </w:rPr>
+        <w:t>1,497 AVSpeech segments, 13 tuning experiments</w:t>
+      </w:r>
+    </w:p>
+    <w:p>
+      <w:pPr>
+        <w:jc w:val="center"/>
+      </w:pPr>
+      <w:r>
+        <w:rPr>
+          <w:rFonts w:ascii="Calibri" w:hAnsi="Calibri"/>
+          <w:b/>
+          <w:color w:val="333333"/>
+          <w:sz w:val="22"/>
+        </w:rPr>
+        <w:t xml:space="preserve">Last updated: </w:t>
+      </w:r>
+      <w:r>
+        <w:rPr>
+          <w:rFonts w:ascii="Calibri" w:hAnsi="Calibri"/>
+          <w:color w:val="333333"/>
+          <w:sz w:val="22"/>
+        </w:rPr>
+        <w:t>February 19, 2026</w:t>
+      </w:r>
+    </w:p>
+    <w:p>
       <w:r>
         <w:br w:type="page"/>
       </w:r>
+    </w:p>
+    <w:p>
+      <w:pPr>
+        <w:spacing w:after="0"/>
+      </w:pPr>
+    </w:p>
+    <w:p>
+      <w:pPr>
+        <w:spacing w:after="0"/>
+      </w:pPr>
+    </w:p>
+    <w:p>
+      <w:pPr>
+        <w:spacing w:after="0"/>
+      </w:pPr>
     </w:p>
     <w:p>
       <w:pPr>
@@ -130,94 +198,59 @@
       </w:r>
     </w:p>
     <w:p>
-      <w:pPr>
-        <w:spacing w:after="40" w:before="40"/>
-        <w:ind w:left="0"/>
-      </w:pPr>
-      <w:hyperlink w:anchor="sec1">
-        <w:r>
-          <w:rPr>
-            <w:rStyle w:val="Hyperlink"/>
-            <w:sz w:val="22"/>
-            <w:rFonts w:ascii="Calibri" w:hAnsi="Calibri"/>
-            <w:color w:val="1a3a5c"/>
-            <w:u w:val="single"/>
-          </w:rPr>
-          <w:t xml:space="preserve">1. Introduction — Why Multiple Metrics?</w:t>
-        </w:r>
-      </w:hyperlink>
-    </w:p>
-    <w:p>
-      <w:pPr>
-        <w:spacing w:after="40" w:before="40"/>
-        <w:ind w:left="0"/>
-      </w:pPr>
-      <w:hyperlink w:anchor="sec2">
-        <w:r>
-          <w:rPr>
-            <w:rStyle w:val="Hyperlink"/>
-            <w:sz w:val="22"/>
-            <w:rFonts w:ascii="Calibri" w:hAnsi="Calibri"/>
-            <w:color w:val="1a3a5c"/>
-            <w:u w:val="single"/>
-          </w:rPr>
-          <w:t xml:space="preserve">2. WER (Word Error Rate)</w:t>
-        </w:r>
-      </w:hyperlink>
-    </w:p>
-    <w:p>
-      <w:pPr>
-        <w:spacing w:after="40" w:before="40"/>
-        <w:ind w:left="0"/>
-      </w:pPr>
-      <w:hyperlink w:anchor="sec3">
-        <w:r>
-          <w:rPr>
-            <w:rStyle w:val="Hyperlink"/>
-            <w:sz w:val="22"/>
-            <w:rFonts w:ascii="Calibri" w:hAnsi="Calibri"/>
-            <w:color w:val="1a3a5c"/>
-            <w:u w:val="single"/>
-          </w:rPr>
-          <w:t xml:space="preserve">3. WWER (Weighted Word Error Rate) &amp; spaCy</w:t>
-        </w:r>
-      </w:hyperlink>
-    </w:p>
-    <w:p>
-      <w:pPr>
-        <w:spacing w:after="40" w:before="40"/>
-        <w:ind w:left="0"/>
-      </w:pPr>
-      <w:hyperlink w:anchor="sec4">
-        <w:r>
-          <w:rPr>
-            <w:rStyle w:val="Hyperlink"/>
-            <w:sz w:val="22"/>
-            <w:rFonts w:ascii="Calibri" w:hAnsi="Calibri"/>
-            <w:color w:val="1a3a5c"/>
-            <w:u w:val="single"/>
-          </w:rPr>
-          <w:t xml:space="preserve">4. NEA (Named Entity Accuracy)</w:t>
-        </w:r>
-      </w:hyperlink>
-    </w:p>
-    <w:p>
-      <w:pPr>
-        <w:spacing w:after="40" w:before="40"/>
-        <w:ind w:left="0"/>
-      </w:pPr>
-      <w:hyperlink w:anchor="sec5">
-        <w:r>
-          <w:rPr>
-            <w:rStyle w:val="Hyperlink"/>
-            <w:sz w:val="22"/>
-            <w:rFonts w:ascii="Calibri" w:hAnsi="Calibri"/>
-            <w:color w:val="1a3a5c"/>
-            <w:u w:val="single"/>
-          </w:rPr>
-          <w:t xml:space="preserve">5. Cross-Metric Analysis &amp; Quick Reference</w:t>
-        </w:r>
-      </w:hyperlink>
+      <w:r>
+        <w:fldChar w:fldCharType="begin"/>
+        <w:instrText xml:space="preserve"> TOC \o "1-2" \h \z \u </w:instrText>
+        <w:fldChar w:fldCharType="separate"/>
+      </w:r>
+      <w:r>
+        <w:rPr>
+          <w:rFonts w:ascii="Calibri" w:hAnsi="Calibri"/>
+          <w:color w:val="1A3A5C"/>
+          <w:sz w:val="22"/>
+        </w:rPr>
+        <w:t>1. Introduction — Why Multiple Metrics?</w:t>
+        <w:br/>
+      </w:r>
+      <w:r>
+        <w:rPr>
+          <w:rFonts w:ascii="Calibri" w:hAnsi="Calibri"/>
+          <w:color w:val="1A3A5C"/>
+          <w:sz w:val="22"/>
+        </w:rPr>
+        <w:t>2. WER (Word Error Rate)</w:t>
+        <w:br/>
+      </w:r>
+      <w:r>
+        <w:rPr>
+          <w:rFonts w:ascii="Calibri" w:hAnsi="Calibri"/>
+          <w:color w:val="1A3A5C"/>
+          <w:sz w:val="22"/>
+        </w:rPr>
+        <w:t>3. WWER (Weighted Word Error Rate) &amp; spaCy</w:t>
+        <w:br/>
+      </w:r>
+      <w:r>
+        <w:rPr>
+          <w:rFonts w:ascii="Calibri" w:hAnsi="Calibri"/>
+          <w:color w:val="1A3A5C"/>
+          <w:sz w:val="22"/>
+        </w:rPr>
+        <w:t>4. NEA (Named Entity Accuracy)</w:t>
+        <w:br/>
+      </w:r>
+      <w:r>
+        <w:rPr>
+          <w:rFonts w:ascii="Calibri" w:hAnsi="Calibri"/>
+          <w:color w:val="1A3A5C"/>
+          <w:sz w:val="22"/>
+        </w:rPr>
+        <w:t>5. Cross-Metric Analysis &amp; Quick Reference</w:t>
+        <w:br/>
+      </w:r>
+      <w:r>
+        <w:fldChar w:fldCharType="end"/>
+      </w:r>
     </w:p>
     <w:p>
       <w:r>
@@ -1754,7 +1787,6 @@
         </w:tc>
       </w:tr>
     </w:tbl>
-    <w:p/>
     <w:p>
       <w:r>
         <w:br w:type="page"/>
@@ -3103,7 +3135,6 @@
         </w:tc>
       </w:tr>
     </w:tbl>
-    <w:p/>
     <w:p>
       <w:r>
         <w:br w:type="page"/>
@@ -6487,7 +6518,6 @@
         </w:tc>
       </w:tr>
     </w:tbl>
-    <w:p/>
     <w:p>
       <w:r>
         <w:br w:type="page"/>
@@ -6581,19 +6611,6 @@
           <w:sz w:val="20"/>
         </w:rPr>
         <w:t>we started looking at structure of hope and the structure of emotion and started really looking</w:t>
-      </w:r>
-    </w:p>
-    <w:p>
-      <w:pPr>
-        <w:spacing w:after="120"/>
-      </w:pPr>
-      <w:r>
-        <w:rPr>
-          <w:rFonts w:ascii="Calibri" w:hAnsi="Calibri"/>
-          <w:b w:val="0"/>
-          <w:i w:val="0"/>
-          <w:sz w:val="22"/>
-        </w:rPr>
       </w:r>
     </w:p>
     <w:tbl>
@@ -9621,6 +9638,11 @@
           <w:sz w:val="22"/>
         </w:rPr>
         <w:t>General rule: If the same substitution appears across all decode configurations (beam search, sampling, different temperatures), it is likely a homophene — a word pair that cannot be distinguished by vision alone. These errors can only be resolved with language model context (future fine-tuning direction).</w:t>
+      </w:r>
+    </w:p>
+    <w:p>
+      <w:r>
+        <w:br w:type="page"/>
       </w:r>
     </w:p>
     <w:p>
@@ -10829,7 +10851,11 @@
         </w:tc>
       </w:tr>
     </w:tbl>
-    <w:p/>
+    <w:p>
+      <w:r>
+        <w:br w:type="page"/>
+      </w:r>
+    </w:p>
     <w:p>
       <w:pPr>
         <w:pStyle w:val="Heading2"/>
@@ -12143,8 +12169,44 @@
   <w:p>
     <w:pPr>
       <w:pStyle w:val="Header"/>
-      <w:jc w:val="right"/>
+      <w:tabs>
+        <w:tab w:pos="9072" w:val="right"/>
+      </w:tabs>
     </w:pPr>
+    <w:r>
+      <w:drawing>
+        <wp:inline distT="0" distB="0" distL="0" distR="0">
+          <wp:extent cx="274320" cy="274320"/>
+          <wp:docPr id="10" name="Header Logo"/>
+          <a:graphic xmlns:a="http://schemas.openxmlformats.org/drawingml/2006/main">
+            <a:graphicData uri="http://schemas.openxmlformats.org/drawingml/2006/picture">
+              <pic:pic xmlns:pic="http://schemas.openxmlformats.org/drawingml/2006/picture">
+                <pic:nvPicPr>
+                  <pic:cNvPr id="0" name="Header Logo"/>
+                  <pic:cNvPicPr/>
+                </pic:nvPicPr>
+                <pic:blipFill>
+                  <a:blip r:embed="rId1"/>
+                  <a:stretch>
+                    <a:fillRect/>
+                  </a:stretch>
+                </pic:blipFill>
+                <pic:spPr>
+                  <a:xfrm>
+                    <a:off x="0" y="0"/>
+                    <a:ext cx="274320" cy="274320"/>
+                  </a:xfrm>
+                  <a:prstGeom prst="rect"/>
+                </pic:spPr>
+              </pic:pic>
+            </a:graphicData>
+          </a:graphic>
+        </wp:inline>
+      </w:drawing>
+    </w:r>
+    <w:r>
+      <w:tab/>
+    </w:r>
     <w:r>
       <w:rPr>
         <w:rFonts w:ascii="Calibri" w:hAnsi="Calibri"/>

</xml_diff>